<commit_message>
Traspaso: seccion 10 solo con la documentacion que importa
Se quitan de la guia las bitacoras de sesion (CONTEXTO_SESION_*, SESION_*):
no son documentacion formal y no hacen falta para tomar el proyecto. Quedan
los seis documentos que si se van a leer, mas dos condicionados a que se
retome la migracion o el chatbot.

PDF y DOCX regenerados desde el markdown ya editado: 10 secciones (se elimino
"Primeros pasos"), indice recalculado, 14 paginas.

El TRASPASO.md no entra en este commit: tiene una edicion con una contrasena
en texto plano pendiente de decidir. Los artefactos publicados aqui NO la
contienen.

Co-Authored-By: Claude Opus 5 <noreply@anthropic.com>
</commit_message>
<xml_diff>
--- a/TRASPASO.docx
+++ b/TRASPASO.docx
@@ -1063,17 +1063,10 @@
     <w:p>
       <w:r>
         <w:rPr>
-          <w:b/>
-          <w:i w:val="0"/>
-        </w:rPr>
-        <w:t>La trampa</w:t>
-      </w:r>
-      <w:r>
-        <w:rPr>
           <w:b w:val="0"/>
           <w:i w:val="0"/>
         </w:rPr>
-        <w:t xml:space="preserve"> aparece después: si algún día el administrador del servidor hace limpieza de cuentas de personal que ya no está y borra </w:t>
+        <w:t xml:space="preserve">El problema aparece después: si algún día el administrador del servidor hace limpieza de cuentas de personal que ya no está y borra </w:t>
       </w:r>
       <w:r>
         <w:rPr>
@@ -1144,26 +1137,17 @@
     <w:p>
       <w:r>
         <w:rPr>
+          <w:b/>
+          <w:i w:val="0"/>
+        </w:rPr>
+        <w:t>Qué hacer</w:t>
+      </w:r>
+      <w:r>
+        <w:rPr>
           <w:b w:val="0"/>
           <w:i w:val="0"/>
         </w:rPr>
-        <w:t>Aparte de eso, es mala práctica: producción corriendo bajo la cuenta personal de alguien que ya no está, y a la que quien reciba quizá no tenga acceso.</w:t>
-      </w:r>
-    </w:p>
-    <w:p>
-      <w:r>
-        <w:rPr>
-          <w:b/>
-          <w:i w:val="0"/>
-        </w:rPr>
-        <w:t>Qué hacer</w:t>
-      </w:r>
-      <w:r>
-        <w:rPr>
-          <w:b w:val="0"/>
-          <w:i w:val="0"/>
-        </w:rPr>
-        <w:t xml:space="preserve"> (sin prisa, pero antes de que alguien toque las cuentas del servidor): crear un usuario de servicio dedicado, p. ej. </w:t>
+        <w:t xml:space="preserve"> crear un usuario de servicio dedicado, p. ej. </w:t>
       </w:r>
       <w:r>
         <w:rPr>
@@ -1501,28 +1485,47 @@
           <w:b/>
           <w:i w:val="0"/>
         </w:rPr>
-        <w:t>Qué hacer:</w:t>
+        <w:t>Credenciales de GitLab:</w:t>
       </w:r>
       <w:r>
         <w:rPr>
           <w:b w:val="0"/>
           <w:i w:val="0"/>
         </w:rPr>
-        <w:t xml:space="preserve"> transferir el proyecto a un grupo del área, no a una persona. Y hacer un clon de respaldo </w:t>
-      </w:r>
-      <w:r>
-        <w:rPr>
-          <w:b w:val="0"/>
-          <w:i/>
-        </w:rPr>
-        <w:t>antes</w:t>
-      </w:r>
-      <w:r>
-        <w:rPr>
+        <w:t xml:space="preserve"> usuario </w:t>
+      </w:r>
+      <w:r>
+        <w:rPr>
+          <w:rFonts w:ascii="Consolas" w:hAnsi="Consolas"/>
           <w:b w:val="0"/>
           <w:i w:val="0"/>
-        </w:rPr>
-        <w:t xml:space="preserve"> de cualquier movimiento:</w:t>
+          <w:color w:val="0B3A30"/>
+          <w:sz w:val="18"/>
+        </w:rPr>
+        <w:t>mvazquez</w:t>
+      </w:r>
+      <w:r>
+        <w:rPr>
+          <w:b w:val="0"/>
+          <w:i w:val="0"/>
+        </w:rPr>
+        <w:t>. La contraseña se entrega aparte, por gestor de contraseñas o en persona — no se escribe aquí porque este documento se versiona y quedaría en el historial de git para siempre.</w:t>
+      </w:r>
+    </w:p>
+    <w:p>
+      <w:r>
+        <w:rPr>
+          <w:b/>
+          <w:i w:val="0"/>
+        </w:rPr>
+        <w:t>Qué conviene hacer:</w:t>
+      </w:r>
+      <w:r>
+        <w:rPr>
+          <w:b w:val="0"/>
+          <w:i w:val="0"/>
+        </w:rPr>
+        <w:t xml:space="preserve"> transferir el proyecto a un grupo del área en vez de heredar una cuenta personal, y sacar un clon de respaldo antes de moverlo:</w:t>
       </w:r>
     </w:p>
     <w:p>
@@ -1639,17 +1642,10 @@
     <w:p>
       <w:r>
         <w:rPr>
-          <w:b/>
-          <w:i w:val="0"/>
-        </w:rPr>
-        <w:t>No hay secretos en el repositorio y no deben agregarse.</w:t>
-      </w:r>
-      <w:r>
-        <w:rPr>
           <w:b w:val="0"/>
           <w:i w:val="0"/>
         </w:rPr>
-        <w:t xml:space="preserve"> Todo se configura por variables de entorno en archivos </w:t>
+        <w:t xml:space="preserve">Todo se configura por variables de entorno en archivos </w:t>
       </w:r>
       <w:r>
         <w:rPr>
@@ -1677,29 +1673,6 @@
           <w:sz w:val="18"/>
         </w:rPr>
         <w:t>.gitignore</w:t>
-      </w:r>
-      <w:r>
-        <w:rPr>
-          <w:b w:val="0"/>
-          <w:i w:val="0"/>
-        </w:rPr>
-        <w:t>.</w:t>
-      </w:r>
-    </w:p>
-    <w:p>
-      <w:r>
-        <w:rPr>
-          <w:b w:val="0"/>
-          <w:i w:val="0"/>
-        </w:rPr>
-        <w:t xml:space="preserve">Pidan que los valores se entreguen por un gestor de contraseñas o canal seguro, </w:t>
-      </w:r>
-      <w:r>
-        <w:rPr>
-          <w:b/>
-          <w:i w:val="0"/>
-        </w:rPr>
-        <w:t>nunca por correo ni dentro del repo</w:t>
       </w:r>
       <w:r>
         <w:rPr>
@@ -3182,25 +3155,7 @@
           <w:i w:val="0"/>
           <w:sz w:val="19"/>
         </w:rPr>
-        <w:t xml:space="preserve"> — usa los defaults. Es cómodo y peligroso a la vez: verifiquen que </w:t>
-      </w:r>
-      <w:r>
-        <w:rPr>
-          <w:rFonts w:ascii="Consolas" w:hAnsi="Consolas"/>
-          <w:b w:val="0"/>
-          <w:i w:val="0"/>
-          <w:color w:val="0B3A30"/>
-          <w:sz w:val="19"/>
-        </w:rPr>
-        <w:t>ADMIN_KEY</w:t>
-      </w:r>
-      <w:r>
-        <w:rPr>
-          <w:b w:val="0"/>
-          <w:i w:val="0"/>
-          <w:sz w:val="19"/>
-        </w:rPr>
-        <w:t xml:space="preserve"> no se haya quedado en el default.</w:t>
+        <w:t xml:space="preserve"> — usa los defaults.</w:t>
       </w:r>
     </w:p>
     <w:p>
@@ -5498,7 +5453,7 @@
         <w:pStyle w:val="Heading3"/>
       </w:pPr>
       <w:r>
-        <w:t>8.7 Trampas conocidas</w:t>
+        <w:t>8.7 Validaciones</w:t>
       </w:r>
     </w:p>
     <w:p>
@@ -5604,126 +5559,7 @@
           <w:b w:val="0"/>
           <w:i w:val="0"/>
         </w:rPr>
-        <w:t xml:space="preserve"> Deshace el despliegue que acaba de funcionar. Pasó dos veces seguidas y costó un buen rato entender por qué el código nuevo "no se aplicaba".</w:t>
-      </w:r>
-    </w:p>
-    <w:p>
-      <w:pPr>
-        <w:pStyle w:val="ListBullet"/>
-        <w:ind w:left="360"/>
-      </w:pPr>
-      <w:r>
-        <w:rPr>
-          <w:b/>
-          <w:i w:val="0"/>
-        </w:rPr>
-        <w:t>PowerShell vs bash:</w:t>
-      </w:r>
-      <w:r>
-        <w:rPr>
-          <w:b w:val="0"/>
-          <w:i w:val="0"/>
-        </w:rPr>
-        <w:t xml:space="preserve"> </w:t>
-      </w:r>
-      <w:r>
-        <w:rPr>
-          <w:rFonts w:ascii="Consolas" w:hAnsi="Consolas"/>
-          <w:b w:val="0"/>
-          <w:i w:val="0"/>
-          <w:color w:val="0B3A30"/>
-          <w:sz w:val="18"/>
-        </w:rPr>
-        <w:t>&amp;&amp;</w:t>
-      </w:r>
-      <w:r>
-        <w:rPr>
-          <w:b w:val="0"/>
-          <w:i w:val="0"/>
-        </w:rPr>
-        <w:t xml:space="preserve"> no es separador válido en PowerShell y </w:t>
-      </w:r>
-      <w:r>
-        <w:rPr>
-          <w:rFonts w:ascii="Consolas" w:hAnsi="Consolas"/>
-          <w:b w:val="0"/>
-          <w:i w:val="0"/>
-          <w:color w:val="0B3A30"/>
-          <w:sz w:val="18"/>
-        </w:rPr>
-        <w:t>ssh-copy-id</w:t>
-      </w:r>
-      <w:r>
-        <w:rPr>
-          <w:b w:val="0"/>
-          <w:i w:val="0"/>
-        </w:rPr>
-        <w:t xml:space="preserve"> no existe ahí. Lo más seguro es </w:t>
-      </w:r>
-      <w:r>
-        <w:rPr>
-          <w:rFonts w:ascii="Consolas" w:hAnsi="Consolas"/>
-          <w:b w:val="0"/>
-          <w:i w:val="0"/>
-          <w:color w:val="0B3A30"/>
-          <w:sz w:val="18"/>
-        </w:rPr>
-        <w:t>ssh -t usuario@host 'comando'</w:t>
-      </w:r>
-      <w:r>
-        <w:rPr>
-          <w:b w:val="0"/>
-          <w:i w:val="0"/>
-        </w:rPr>
-        <w:t xml:space="preserve"> con comillas </w:t>
-      </w:r>
-      <w:r>
-        <w:rPr>
-          <w:b/>
-          <w:i w:val="0"/>
-        </w:rPr>
-        <w:t>simples</w:t>
-      </w:r>
-      <w:r>
-        <w:rPr>
-          <w:b w:val="0"/>
-          <w:i w:val="0"/>
-        </w:rPr>
-        <w:t xml:space="preserve">, para que PowerShell no expanda </w:t>
-      </w:r>
-      <w:r>
-        <w:rPr>
-          <w:rFonts w:ascii="Consolas" w:hAnsi="Consolas"/>
-          <w:b w:val="0"/>
-          <w:i w:val="0"/>
-          <w:color w:val="0B3A30"/>
-          <w:sz w:val="18"/>
-        </w:rPr>
-        <w:t>$(...)</w:t>
-      </w:r>
-      <w:r>
-        <w:rPr>
-          <w:b w:val="0"/>
-          <w:i w:val="0"/>
-        </w:rPr>
-        <w:t xml:space="preserve"> ni </w:t>
-      </w:r>
-      <w:r>
-        <w:rPr>
-          <w:rFonts w:ascii="Consolas" w:hAnsi="Consolas"/>
-          <w:b w:val="0"/>
-          <w:i w:val="0"/>
-          <w:color w:val="0B3A30"/>
-          <w:sz w:val="18"/>
-        </w:rPr>
-        <w:t>*</w:t>
-      </w:r>
-      <w:r>
-        <w:rPr>
-          <w:b w:val="0"/>
-          <w:i w:val="0"/>
-        </w:rPr>
-        <w:t>.</w:t>
+        <w:t xml:space="preserve"> Deshace el despliegue que acaba de funcionar. Solo ejecutar si el primero no funcipnó.</w:t>
       </w:r>
     </w:p>
     <w:p>
@@ -6189,7 +6025,7 @@
           <w:b w:val="0"/>
           <w:i w:val="0"/>
         </w:rPr>
-        <w:t xml:space="preserve"> — léanlos antes de cambiar algo ahí; muchos documentan errores ya cometidos.</w:t>
+        <w:t xml:space="preserve"> — léanlos antes de cambiar algo ahí.</w:t>
       </w:r>
     </w:p>
     <w:p>
@@ -6407,7 +6243,7 @@
           <w:b w:val="0"/>
           <w:i w:val="0"/>
         </w:rPr>
-        <w:t xml:space="preserve">Hay ~30 archivos </w:t>
+        <w:t xml:space="preserve">Estos son los documentos que vale la pena conservar y leer. El resto de archivos </w:t>
       </w:r>
       <w:r>
         <w:rPr>
@@ -6424,21 +6260,7 @@
           <w:b w:val="0"/>
           <w:i w:val="0"/>
         </w:rPr>
-        <w:t xml:space="preserve"> en la raíz. </w:t>
-      </w:r>
-      <w:r>
-        <w:rPr>
-          <w:b/>
-          <w:i w:val="0"/>
-        </w:rPr>
-        <w:t>Casi todos son bitácoras de sesión</w:t>
-      </w:r>
-      <w:r>
-        <w:rPr>
-          <w:b w:val="0"/>
-          <w:i w:val="0"/>
-        </w:rPr>
-        <w:t>, útiles como arqueología pero no como manual. Orden de lectura sugerido:</w:t>
+        <w:t xml:space="preserve"> de la raíz son bitácoras de las sesiones de trabajo: no son documentación formal y solo sirven para responder "¿por qué está hecho así?".</w:t>
       </w:r>
     </w:p>
     <w:tbl>
@@ -6546,7 +6368,7 @@
             <w:r>
               <w:rPr>
                 <w:rFonts w:ascii="Consolas" w:hAnsi="Consolas"/>
-                <w:b/>
+                <w:b w:val="0"/>
                 <w:i w:val="0"/>
                 <w:color w:val="0B3A30"/>
                 <w:sz w:val="18"/>
@@ -6607,7 +6429,7 @@
             <w:r>
               <w:rPr>
                 <w:rFonts w:ascii="Consolas" w:hAnsi="Consolas"/>
-                <w:b/>
+                <w:b w:val="0"/>
                 <w:i w:val="0"/>
                 <w:color w:val="0B3A30"/>
                 <w:sz w:val="18"/>
@@ -6668,7 +6490,7 @@
             <w:r>
               <w:rPr>
                 <w:rFonts w:ascii="Consolas" w:hAnsi="Consolas"/>
-                <w:b/>
+                <w:b w:val="0"/>
                 <w:i w:val="0"/>
                 <w:color w:val="0B3A30"/>
                 <w:sz w:val="18"/>
@@ -6729,7 +6551,7 @@
             <w:r>
               <w:rPr>
                 <w:rFonts w:ascii="Consolas" w:hAnsi="Consolas"/>
-                <w:b/>
+                <w:b w:val="0"/>
                 <w:i w:val="0"/>
                 <w:color w:val="0B3A30"/>
                 <w:sz w:val="18"/>
@@ -6790,7 +6612,7 @@
             <w:r>
               <w:rPr>
                 <w:rFonts w:ascii="Consolas" w:hAnsi="Consolas"/>
-                <w:b/>
+                <w:b w:val="0"/>
                 <w:i w:val="0"/>
                 <w:color w:val="0B3A30"/>
                 <w:sz w:val="18"/>
@@ -6856,7 +6678,7 @@
                 <w:color w:val="0B3A30"/>
                 <w:sz w:val="18"/>
               </w:rPr>
-              <w:t>postgres_migration/MIGRATION_STATUS.md</w:t>
+              <w:t>README.md</w:t>
             </w:r>
           </w:p>
         </w:tc>
@@ -6875,280 +6697,8 @@
                 <w:i w:val="0"/>
                 <w:sz w:val="18"/>
               </w:rPr>
-              <w:t>Estado de la migración</w:t>
+              <w:t xml:space="preserve">Presentación del proyecto. </w:t>
             </w:r>
-          </w:p>
-        </w:tc>
-      </w:tr>
-      <w:tr>
-        <w:tc>
-          <w:tcPr>
-            <w:tcW w:type="dxa" w:w="720"/>
-            <w:shd w:val="clear" w:color="auto" w:fill="FFFFFF"/>
-          </w:tcPr>
-          <w:p>
-            <w:pPr>
-              <w:spacing w:after="40"/>
-            </w:pPr>
-            <w:r>
-              <w:rPr>
-                <w:b w:val="0"/>
-                <w:i w:val="0"/>
-                <w:sz w:val="18"/>
-              </w:rPr>
-              <w:t>7</w:t>
-            </w:r>
-          </w:p>
-        </w:tc>
-        <w:tc>
-          <w:tcPr>
-            <w:tcW w:type="dxa" w:w="4464"/>
-            <w:shd w:val="clear" w:color="auto" w:fill="FFFFFF"/>
-          </w:tcPr>
-          <w:p>
-            <w:pPr>
-              <w:spacing w:after="40"/>
-            </w:pPr>
-            <w:r>
-              <w:rPr>
-                <w:rFonts w:ascii="Consolas" w:hAnsi="Consolas"/>
-                <w:b w:val="0"/>
-                <w:i w:val="0"/>
-                <w:color w:val="0B3A30"/>
-                <w:sz w:val="18"/>
-              </w:rPr>
-              <w:t>CHATBOT_PENDIENTE.md</w:t>
-            </w:r>
-          </w:p>
-        </w:tc>
-        <w:tc>
-          <w:tcPr>
-            <w:tcW w:type="dxa" w:w="4464"/>
-            <w:shd w:val="clear" w:color="auto" w:fill="FFFFFF"/>
-          </w:tcPr>
-          <w:p>
-            <w:pPr>
-              <w:spacing w:after="40"/>
-            </w:pPr>
-            <w:r>
-              <w:rPr>
-                <w:b w:val="0"/>
-                <w:i w:val="0"/>
-                <w:sz w:val="18"/>
-              </w:rPr>
-              <w:t>El chat en pausa</w:t>
-            </w:r>
-          </w:p>
-        </w:tc>
-      </w:tr>
-      <w:tr>
-        <w:tc>
-          <w:tcPr>
-            <w:tcW w:type="dxa" w:w="720"/>
-            <w:shd w:val="clear" w:color="auto" w:fill="F8FAFC"/>
-          </w:tcPr>
-          <w:p>
-            <w:pPr>
-              <w:spacing w:after="40"/>
-            </w:pPr>
-            <w:r>
-              <w:rPr>
-                <w:b w:val="0"/>
-                <w:i w:val="0"/>
-                <w:sz w:val="18"/>
-              </w:rPr>
-              <w:t>—</w:t>
-            </w:r>
-          </w:p>
-        </w:tc>
-        <w:tc>
-          <w:tcPr>
-            <w:tcW w:type="dxa" w:w="4464"/>
-            <w:shd w:val="clear" w:color="auto" w:fill="F8FAFC"/>
-          </w:tcPr>
-          <w:p>
-            <w:pPr>
-              <w:spacing w:after="40"/>
-            </w:pPr>
-            <w:r>
-              <w:rPr>
-                <w:rFonts w:ascii="Consolas" w:hAnsi="Consolas"/>
-                <w:b w:val="0"/>
-                <w:i w:val="0"/>
-                <w:color w:val="0B3A30"/>
-                <w:sz w:val="18"/>
-              </w:rPr>
-              <w:t>CONSULTAS_SQL_SIH.md</w:t>
-            </w:r>
-          </w:p>
-        </w:tc>
-        <w:tc>
-          <w:tcPr>
-            <w:tcW w:type="dxa" w:w="4464"/>
-            <w:shd w:val="clear" w:color="auto" w:fill="F8FAFC"/>
-          </w:tcPr>
-          <w:p>
-            <w:pPr>
-              <w:spacing w:after="40"/>
-            </w:pPr>
-            <w:r>
-              <w:rPr>
-                <w:b w:val="0"/>
-                <w:i w:val="0"/>
-                <w:sz w:val="18"/>
-              </w:rPr>
-              <w:t>Consultas de referencia del sistema anterior</w:t>
-            </w:r>
-          </w:p>
-        </w:tc>
-      </w:tr>
-      <w:tr>
-        <w:tc>
-          <w:tcPr>
-            <w:tcW w:type="dxa" w:w="720"/>
-            <w:shd w:val="clear" w:color="auto" w:fill="FFFFFF"/>
-          </w:tcPr>
-          <w:p>
-            <w:pPr>
-              <w:spacing w:after="40"/>
-            </w:pPr>
-            <w:r>
-              <w:rPr>
-                <w:b w:val="0"/>
-                <w:i w:val="0"/>
-                <w:sz w:val="18"/>
-              </w:rPr>
-              <w:t>—</w:t>
-            </w:r>
-          </w:p>
-        </w:tc>
-        <w:tc>
-          <w:tcPr>
-            <w:tcW w:type="dxa" w:w="4464"/>
-            <w:shd w:val="clear" w:color="auto" w:fill="FFFFFF"/>
-          </w:tcPr>
-          <w:p>
-            <w:pPr>
-              <w:spacing w:after="40"/>
-            </w:pPr>
-            <w:r>
-              <w:rPr>
-                <w:rFonts w:ascii="Consolas" w:hAnsi="Consolas"/>
-                <w:b w:val="0"/>
-                <w:i w:val="0"/>
-                <w:color w:val="0B3A30"/>
-                <w:sz w:val="18"/>
-              </w:rPr>
-              <w:t>CONTEXTO_SESION_*.md</w:t>
-            </w:r>
-            <w:r>
-              <w:rPr>
-                <w:b w:val="0"/>
-                <w:i w:val="0"/>
-                <w:sz w:val="18"/>
-              </w:rPr>
-              <w:t xml:space="preserve">, </w:t>
-            </w:r>
-            <w:r>
-              <w:rPr>
-                <w:rFonts w:ascii="Consolas" w:hAnsi="Consolas"/>
-                <w:b w:val="0"/>
-                <w:i w:val="0"/>
-                <w:color w:val="0B3A30"/>
-                <w:sz w:val="18"/>
-              </w:rPr>
-              <w:t>SESION_*.md</w:t>
-            </w:r>
-          </w:p>
-        </w:tc>
-        <w:tc>
-          <w:tcPr>
-            <w:tcW w:type="dxa" w:w="4464"/>
-            <w:shd w:val="clear" w:color="auto" w:fill="FFFFFF"/>
-          </w:tcPr>
-          <w:p>
-            <w:pPr>
-              <w:spacing w:after="40"/>
-            </w:pPr>
-            <w:r>
-              <w:rPr>
-                <w:b/>
-                <w:i w:val="0"/>
-                <w:sz w:val="18"/>
-              </w:rPr>
-              <w:t>Bitácoras.</w:t>
-            </w:r>
-            <w:r>
-              <w:rPr>
-                <w:b w:val="0"/>
-                <w:i w:val="0"/>
-                <w:sz w:val="18"/>
-              </w:rPr>
-              <w:t xml:space="preserve"> No son documentación formal. Sirven para responder "¿por qué está hecho así?". El más reciente es </w:t>
-            </w:r>
-            <w:r>
-              <w:rPr>
-                <w:rFonts w:ascii="Consolas" w:hAnsi="Consolas"/>
-                <w:b w:val="0"/>
-                <w:i w:val="0"/>
-                <w:color w:val="0B3A30"/>
-                <w:sz w:val="18"/>
-              </w:rPr>
-              <w:t>CONTEXTO_SESION_TABLAS_EXPORTS_DESPLIEGUE.md</w:t>
-            </w:r>
-            <w:r>
-              <w:rPr>
-                <w:b w:val="0"/>
-                <w:i w:val="0"/>
-                <w:sz w:val="18"/>
-              </w:rPr>
-              <w:t>.</w:t>
-            </w:r>
-          </w:p>
-        </w:tc>
-      </w:tr>
-      <w:tr>
-        <w:tc>
-          <w:tcPr>
-            <w:tcW w:type="dxa" w:w="720"/>
-            <w:shd w:val="clear" w:color="auto" w:fill="F8FAFC"/>
-          </w:tcPr>
-          <w:p>
-            <w:pPr>
-              <w:spacing w:after="40"/>
-            </w:pPr>
-          </w:p>
-        </w:tc>
-        <w:tc>
-          <w:tcPr>
-            <w:tcW w:type="dxa" w:w="4464"/>
-            <w:shd w:val="clear" w:color="auto" w:fill="F8FAFC"/>
-          </w:tcPr>
-          <w:p>
-            <w:pPr>
-              <w:spacing w:after="40"/>
-            </w:pPr>
-            <w:r>
-              <w:rPr>
-                <w:rFonts w:ascii="Consolas" w:hAnsi="Consolas"/>
-                <w:b w:val="0"/>
-                <w:i w:val="0"/>
-                <w:color w:val="0B3A30"/>
-                <w:sz w:val="18"/>
-              </w:rPr>
-              <w:t>README.md</w:t>
-            </w:r>
-          </w:p>
-        </w:tc>
-        <w:tc>
-          <w:tcPr>
-            <w:tcW w:type="dxa" w:w="4464"/>
-            <w:shd w:val="clear" w:color="auto" w:fill="F8FAFC"/>
-          </w:tcPr>
-          <w:p>
-            <w:pPr>
-              <w:spacing w:after="40"/>
-            </w:pPr>
             <w:r>
               <w:rPr>
                 <w:b/>
@@ -7175,113 +6725,155 @@
       </w:pPr>
     </w:p>
     <w:p>
-      <w:pPr>
-        <w:pStyle w:val="Heading2"/>
-      </w:pPr>
-      <w:r>
-        <w:t>11. Primeros pasos para quien recibe</w:t>
+      <w:r>
+        <w:rPr>
+          <w:b w:val="0"/>
+          <w:i w:val="0"/>
+        </w:rPr>
+        <w:t>Y dos que solo hacen falta si se retoma ese frente:</w:t>
       </w:r>
     </w:p>
+    <w:tbl>
+      <w:tblPr>
+        <w:tblStyle w:val="TableGrid"/>
+        <w:tblW w:type="auto" w:w="0"/>
+        <w:tblLook w:firstColumn="1" w:firstRow="1" w:lastColumn="0" w:lastRow="0" w:noHBand="0" w:noVBand="1" w:val="04A0"/>
+      </w:tblPr>
+      <w:tblGrid>
+        <w:gridCol w:w="4824"/>
+        <w:gridCol w:w="4824"/>
+      </w:tblGrid>
+      <w:tr>
+        <w:tc>
+          <w:tcPr>
+            <w:tcW w:type="dxa" w:w="4824"/>
+            <w:shd w:val="clear" w:color="auto" w:fill="10312B"/>
+          </w:tcPr>
+          <w:p>
+            <w:pPr>
+              <w:spacing w:after="40"/>
+            </w:pPr>
+            <w:r>
+              <w:rPr>
+                <w:b/>
+                <w:i w:val="0"/>
+                <w:color w:val="FFFFFF"/>
+                <w:sz w:val="18"/>
+              </w:rPr>
+              <w:t>Archivo</w:t>
+            </w:r>
+          </w:p>
+        </w:tc>
+        <w:tc>
+          <w:tcPr>
+            <w:tcW w:type="dxa" w:w="4824"/>
+            <w:shd w:val="clear" w:color="auto" w:fill="10312B"/>
+          </w:tcPr>
+          <w:p>
+            <w:pPr>
+              <w:spacing w:after="40"/>
+            </w:pPr>
+            <w:r>
+              <w:rPr>
+                <w:b/>
+                <w:i w:val="0"/>
+                <w:color w:val="FFFFFF"/>
+                <w:sz w:val="18"/>
+              </w:rPr>
+              <w:t>Cuándo</w:t>
+            </w:r>
+          </w:p>
+        </w:tc>
+      </w:tr>
+      <w:tr>
+        <w:tc>
+          <w:tcPr>
+            <w:tcW w:type="dxa" w:w="4824"/>
+            <w:shd w:val="clear" w:color="auto" w:fill="FFFFFF"/>
+          </w:tcPr>
+          <w:p>
+            <w:pPr>
+              <w:spacing w:after="40"/>
+            </w:pPr>
+            <w:r>
+              <w:rPr>
+                <w:rFonts w:ascii="Consolas" w:hAnsi="Consolas"/>
+                <w:b w:val="0"/>
+                <w:i w:val="0"/>
+                <w:color w:val="0B3A30"/>
+                <w:sz w:val="18"/>
+              </w:rPr>
+              <w:t>postgres_migration/MIGRATION_STATUS.md</w:t>
+            </w:r>
+          </w:p>
+        </w:tc>
+        <w:tc>
+          <w:tcPr>
+            <w:tcW w:type="dxa" w:w="4824"/>
+            <w:shd w:val="clear" w:color="auto" w:fill="FFFFFF"/>
+          </w:tcPr>
+          <w:p>
+            <w:pPr>
+              <w:spacing w:after="40"/>
+            </w:pPr>
+            <w:r>
+              <w:rPr>
+                <w:b w:val="0"/>
+                <w:i w:val="0"/>
+                <w:sz w:val="18"/>
+              </w:rPr>
+              <w:t>Si se retoma la migración (§7.1)</w:t>
+            </w:r>
+          </w:p>
+        </w:tc>
+      </w:tr>
+      <w:tr>
+        <w:tc>
+          <w:tcPr>
+            <w:tcW w:type="dxa" w:w="4824"/>
+            <w:shd w:val="clear" w:color="auto" w:fill="F8FAFC"/>
+          </w:tcPr>
+          <w:p>
+            <w:pPr>
+              <w:spacing w:after="40"/>
+            </w:pPr>
+            <w:r>
+              <w:rPr>
+                <w:rFonts w:ascii="Consolas" w:hAnsi="Consolas"/>
+                <w:b w:val="0"/>
+                <w:i w:val="0"/>
+                <w:color w:val="0B3A30"/>
+                <w:sz w:val="18"/>
+              </w:rPr>
+              <w:t>CHATBOT_PENDIENTE.md</w:t>
+            </w:r>
+          </w:p>
+        </w:tc>
+        <w:tc>
+          <w:tcPr>
+            <w:tcW w:type="dxa" w:w="4824"/>
+            <w:shd w:val="clear" w:color="auto" w:fill="F8FAFC"/>
+          </w:tcPr>
+          <w:p>
+            <w:pPr>
+              <w:spacing w:after="40"/>
+            </w:pPr>
+            <w:r>
+              <w:rPr>
+                <w:b w:val="0"/>
+                <w:i w:val="0"/>
+                <w:sz w:val="18"/>
+              </w:rPr>
+              <w:t>Si se retoma el chatbot (§7.2)</w:t>
+            </w:r>
+          </w:p>
+        </w:tc>
+      </w:tr>
+    </w:tbl>
     <w:p>
       <w:pPr>
-        <w:pStyle w:val="ListNumber"/>
+        <w:spacing w:after="40"/>
       </w:pPr>
-      <w:r>
-        <w:rPr>
-          <w:b w:val="0"/>
-          <w:i w:val="0"/>
-        </w:rPr>
-        <w:t>Pedir los accesos de §3.1 y clonar el repositorio.</w:t>
-      </w:r>
-    </w:p>
-    <w:p>
-      <w:pPr>
-        <w:pStyle w:val="ListNumber"/>
-      </w:pPr>
-      <w:r>
-        <w:rPr>
-          <w:b w:val="0"/>
-          <w:i w:val="0"/>
-        </w:rPr>
-        <w:t>Instalar el driver ODBC y levantar en local (§5).</w:t>
-      </w:r>
-    </w:p>
-    <w:p>
-      <w:pPr>
-        <w:pStyle w:val="ListNumber"/>
-      </w:pPr>
-      <w:r>
-        <w:rPr>
-          <w:b w:val="0"/>
-          <w:i w:val="0"/>
-        </w:rPr>
-        <w:t xml:space="preserve">Leer </w:t>
-      </w:r>
-      <w:r>
-        <w:rPr>
-          <w:rFonts w:ascii="Consolas" w:hAnsi="Consolas"/>
-          <w:b w:val="0"/>
-          <w:i w:val="0"/>
-          <w:color w:val="0B3A30"/>
-          <w:sz w:val="18"/>
-        </w:rPr>
-        <w:t>CLAUDE.md</w:t>
-      </w:r>
-      <w:r>
-        <w:rPr>
-          <w:b w:val="0"/>
-          <w:i w:val="0"/>
-        </w:rPr>
-        <w:t xml:space="preserve"> y </w:t>
-      </w:r>
-      <w:r>
-        <w:rPr>
-          <w:rFonts w:ascii="Consolas" w:hAnsi="Consolas"/>
-          <w:b w:val="0"/>
-          <w:i w:val="0"/>
-          <w:color w:val="0B3A30"/>
-          <w:sz w:val="18"/>
-        </w:rPr>
-        <w:t>DATABASE_SCHEMA.md</w:t>
-      </w:r>
-      <w:r>
-        <w:rPr>
-          <w:b w:val="0"/>
-          <w:i w:val="0"/>
-        </w:rPr>
-        <w:t>.</w:t>
-      </w:r>
-    </w:p>
-    <w:p>
-      <w:pPr>
-        <w:pStyle w:val="ListNumber"/>
-      </w:pPr>
-      <w:r>
-        <w:rPr>
-          <w:b/>
-          <w:i w:val="0"/>
-        </w:rPr>
-        <w:t>Reubicar lo que estaba local (§2)</w:t>
-      </w:r>
-      <w:r>
-        <w:rPr>
-          <w:b w:val="0"/>
-          <w:i w:val="0"/>
-        </w:rPr>
-        <w:t>, empezando por 2.3 (transferir el repositorio), que es lo único con urgencia real. Lo demás puede ordenarse con calma.</w:t>
-      </w:r>
-    </w:p>
-    <w:p>
-      <w:pPr>
-        <w:pStyle w:val="ListNumber"/>
-      </w:pPr>
-      <w:r>
-        <w:rPr>
-          <w:b w:val="0"/>
-          <w:i w:val="0"/>
-        </w:rPr>
-        <w:t>Hacer un cambio mínimo de frontend y desplegarlo siguiendo §8, para probar el circuito completo con red de seguridad.</w:t>
-      </w:r>
     </w:p>
     <w:sectPr>
       <w:pgSz w:w="12240" w:h="15840"/>

</xml_diff>